<commit_message>
Capture federal grade evidence phase one
</commit_message>
<xml_diff>
--- a/source/Christian_Estrada_KPMG_Final_Tightened_EdFix.docx
+++ b/source/Christian_Estrada_KPMG_Final_Tightened_EdFix.docx
@@ -179,6 +179,14 @@
     <w:p>
       <w:pPr>
         <w:pStyle w:val="ListBullet"/>
+      </w:pPr>
+      <w:r>
+        <w:t>Led enterprise systems modernization that improved reliability and reduced unplanned downtime by roughly 25%, supported reporting and decisions affecting $20M+ in daily inventory, and cut inventory scrap cost by about 32% through inventory automation and tracking designed for warehouse operations.</w:t>
+      </w:r>
+    </w:p>
+    <w:p>
+      <w:pPr>
+        <w:pStyle w:val="ListBullet"/>
         <w:spacing w:after="0" w:line="240" w:lineRule="auto"/>
       </w:pPr>
       <w:r>
@@ -227,13 +235,7 @@
         <w:spacing w:after="0" w:line="240" w:lineRule="auto"/>
       </w:pPr>
       <w:r>
-        <w:rPr>
-          <w:rFonts w:ascii="Calibri" w:hAnsi="Calibri" w:eastAsia="Calibri"/>
-          <w:b w:val="0"/>
-          <w:i w:val="0"/>
-          <w:sz w:val="20"/>
-        </w:rPr>
-        <w:t>Implemented least-privilege security models with dynamic access controls for sensitive financial and inventory transactions, improving audit readiness and compliance posture</w:t>
+        <w:t>Applied zero-trust-aligned least-privilege access, role-based access controls, and dynamic permission frameworks for sensitive financial and inventory transactions while supporting incident-response readiness and access validation for the global IT team supporting Aptean Intuitive.</w:t>
       </w:r>
     </w:p>
     <w:p>
@@ -906,6 +908,24 @@
         <w:t>ITIL 4 Foundation  |  ServiceNow NextGen System Administrator  |  McKinsey Forward Learners</w:t>
       </w:r>
     </w:p>
+    <w:p>
+      <w:pPr/>
+      <w:r>
+        <w:t>Volunteer Experience</w:t>
+      </w:r>
+    </w:p>
+    <w:p>
+      <w:pPr/>
+      <w:r>
+        <w:t>Cybersecurity Track Lead (Volunteer), Grow With Google - Mentor Me Collective</w:t>
+      </w:r>
+    </w:p>
+    <w:p>
+      <w:pPr/>
+      <w:r>
+        <w:t>Led and mentored participants in the cybersecurity track as a volunteer, helping learners connect cybersecurity concepts to practical career development.</w:t>
+      </w:r>
+    </w:p>
     <w:sectPr>
       <w:pgSz w:w="12240" w:h="15840"/>
       <w:pgMar w:top="720" w:right="720" w:bottom="720" w:left="720" w:header="720" w:footer="720" w:gutter="0"/>

</xml_diff>